<commit_message>
Update invoice styling, add brackets logo, and adjust pricing structure
</commit_message>
<xml_diff>
--- a/Asper infotech Offer Letter.docx
+++ b/Asper infotech Offer Letter.docx
@@ -4,7 +4,7 @@
   <w:body>
     <w:p>
       <w:pPr>
-        <w:spacing w:before="360" w:after="480"/>
+        <w:spacing w:before="480" w:after="480"/>
         <w:jc w:val="center"/>
       </w:pPr>
       <w:r>
@@ -12,18 +12,19 @@
           <w:rFonts w:ascii="Calibri" w:hAnsi="Calibri"/>
           <w:b/>
           <w:color w:val="EA580C"/>
-          <w:sz w:val="44"/>
+          <w:sz w:val="48"/>
         </w:rPr>
         <w:t>PROJECT DELIVERY INVOICE</w:t>
       </w:r>
     </w:p>
     <w:p>
       <w:pPr>
-        <w:spacing w:after="360"/>
+        <w:spacing w:after="400"/>
       </w:pPr>
       <w:r>
         <w:rPr>
           <w:b/>
+          <w:color w:val="0F172A"/>
           <w:sz w:val="21"/>
         </w:rPr>
         <w:t xml:space="preserve">CLIENT: </w:t>
@@ -38,6 +39,7 @@
       <w:r>
         <w:rPr>
           <w:b/>
+          <w:color w:val="0F172A"/>
           <w:sz w:val="21"/>
         </w:rPr>
         <w:t xml:space="preserve">PROJECT: </w:t>
@@ -52,6 +54,7 @@
       <w:r>
         <w:rPr>
           <w:b/>
+          <w:color w:val="0F172A"/>
           <w:sz w:val="21"/>
         </w:rPr>
         <w:t xml:space="preserve">DATE: </w:t>
@@ -66,10 +69,11 @@
     <w:p>
       <w:pPr>
         <w:pStyle w:val="Heading1"/>
-        <w:spacing w:before="360" w:after="120"/>
+        <w:spacing w:before="400" w:after="160"/>
       </w:pPr>
       <w:r>
         <w:rPr>
+          <w:b/>
           <w:color w:val="0F172A"/>
           <w:sz w:val="28"/>
         </w:rPr>
@@ -84,7 +88,7 @@
         <w:rPr>
           <w:b/>
           <w:color w:val="EA580C"/>
-          <w:sz w:val="22"/>
+          <w:sz w:val="23"/>
         </w:rPr>
         <w:t>1.1 Web POS Application</w:t>
         <w:br/>
@@ -176,13 +180,13 @@
     </w:p>
     <w:p>
       <w:pPr>
-        <w:spacing w:before="160" w:after="80"/>
+        <w:spacing w:before="200" w:after="80"/>
       </w:pPr>
       <w:r>
         <w:rPr>
           <w:b/>
           <w:color w:val="EA580C"/>
-          <w:sz w:val="22"/>
+          <w:sz w:val="23"/>
         </w:rPr>
         <w:t>1.2 Desktop Application (Electron Wrapper)</w:t>
         <w:br/>
@@ -202,13 +206,13 @@
     </w:p>
     <w:p>
       <w:pPr>
-        <w:spacing w:before="160" w:after="80"/>
+        <w:spacing w:before="200" w:after="80"/>
       </w:pPr>
       <w:r>
         <w:rPr>
           <w:b/>
           <w:color w:val="EA580C"/>
-          <w:sz w:val="22"/>
+          <w:sz w:val="23"/>
         </w:rPr>
         <w:t>1.3 Mobile Application (Android - Multi-Role Dashboard)</w:t>
         <w:br/>
@@ -265,10 +269,11 @@
     <w:p>
       <w:pPr>
         <w:pStyle w:val="Heading1"/>
-        <w:spacing w:before="400" w:after="200"/>
+        <w:spacing w:before="480" w:after="240"/>
       </w:pPr>
       <w:r>
         <w:rPr>
+          <w:b/>
           <w:color w:val="0F172A"/>
           <w:sz w:val="28"/>
         </w:rPr>
@@ -277,20 +282,32 @@
     </w:p>
     <w:tbl>
       <w:tblPr>
-        <w:tblStyle w:val="LightShading-Accent1"/>
         <w:tblW w:type="auto" w:w="0"/>
+        <w:tblLayout w:type="fixed"/>
         <w:tblLook w:firstColumn="1" w:firstRow="1" w:lastColumn="0" w:lastRow="0" w:noHBand="0" w:noVBand="1" w:val="04A0"/>
       </w:tblPr>
       <w:tblGrid>
-        <w:gridCol w:w="3312"/>
-        <w:gridCol w:w="3312"/>
-        <w:gridCol w:w="3312"/>
+        <w:gridCol w:w="5616"/>
+        <w:gridCol w:w="2160"/>
+        <w:gridCol w:w="2160"/>
       </w:tblGrid>
       <w:tr>
         <w:tc>
           <w:tcPr>
             <w:tcW w:type="dxa" w:w="3312"/>
             <w:shd w:val="clear" w:color="auto" w:fill="0F172A"/>
+            <w:tcMar>
+              <w:top w:w="140" w:type="dxa"/>
+              <w:bottom w:w="140" w:type="dxa"/>
+              <w:left w:w="180" w:type="dxa"/>
+              <w:right w:w="180" w:type="dxa"/>
+            </w:tcMar>
+            <w:tcBorders>
+              <w:top w:val="none"/>
+              <w:left w:val="none"/>
+              <w:bottom w:sz="4" w:val="single" w:color="0F172A"/>
+              <w:right w:val="none"/>
+            </w:tcBorders>
           </w:tcPr>
           <w:p>
             <w:pPr>
@@ -298,8 +315,10 @@
             </w:pPr>
             <w:r>
               <w:rPr>
+                <w:rFonts w:ascii="Calibri" w:hAnsi="Calibri"/>
                 <w:b/>
                 <w:color w:val="FFFFFF"/>
+                <w:sz w:val="21"/>
               </w:rPr>
               <w:t>Module Description</w:t>
             </w:r>
@@ -309,15 +328,29 @@
           <w:tcPr>
             <w:tcW w:type="dxa" w:w="3312"/>
             <w:shd w:val="clear" w:color="auto" w:fill="0F172A"/>
+            <w:tcMar>
+              <w:top w:w="140" w:type="dxa"/>
+              <w:bottom w:w="140" w:type="dxa"/>
+              <w:left w:w="180" w:type="dxa"/>
+              <w:right w:w="180" w:type="dxa"/>
+            </w:tcMar>
+            <w:tcBorders>
+              <w:top w:val="none"/>
+              <w:left w:val="none"/>
+              <w:bottom w:sz="4" w:val="single" w:color="0F172A"/>
+              <w:right w:val="none"/>
+            </w:tcBorders>
           </w:tcPr>
           <w:p>
             <w:pPr>
-              <w:jc w:val="center"/>
+              <w:jc w:val="right"/>
             </w:pPr>
             <w:r>
               <w:rPr>
+                <w:rFonts w:ascii="Calibri" w:hAnsi="Calibri"/>
                 <w:b/>
                 <w:color w:val="FFFFFF"/>
+                <w:sz w:val="21"/>
               </w:rPr>
               <w:t>Market Price</w:t>
             </w:r>
@@ -327,15 +360,29 @@
           <w:tcPr>
             <w:tcW w:type="dxa" w:w="3312"/>
             <w:shd w:val="clear" w:color="auto" w:fill="0F172A"/>
+            <w:tcMar>
+              <w:top w:w="140" w:type="dxa"/>
+              <w:bottom w:w="140" w:type="dxa"/>
+              <w:left w:w="180" w:type="dxa"/>
+              <w:right w:w="180" w:type="dxa"/>
+            </w:tcMar>
+            <w:tcBorders>
+              <w:top w:val="none"/>
+              <w:left w:val="none"/>
+              <w:bottom w:sz="4" w:val="single" w:color="0F172A"/>
+              <w:right w:val="none"/>
+            </w:tcBorders>
           </w:tcPr>
           <w:p>
             <w:pPr>
-              <w:jc w:val="center"/>
+              <w:jc w:val="right"/>
             </w:pPr>
             <w:r>
               <w:rPr>
+                <w:rFonts w:ascii="Calibri" w:hAnsi="Calibri"/>
                 <w:b/>
                 <w:color w:val="FFFFFF"/>
+                <w:sz w:val="21"/>
               </w:rPr>
               <w:t>Charged Price</w:t>
             </w:r>
@@ -346,39 +393,94 @@
         <w:tc>
           <w:tcPr>
             <w:tcW w:type="dxa" w:w="3312"/>
+            <w:shd w:val="clear" w:color="auto" w:fill="FFFFFF"/>
+            <w:tcMar>
+              <w:top w:w="120" w:type="dxa"/>
+              <w:bottom w:w="120" w:type="dxa"/>
+              <w:left w:w="180" w:type="dxa"/>
+              <w:right w:w="180" w:type="dxa"/>
+            </w:tcMar>
+            <w:tcBorders>
+              <w:top w:val="none"/>
+              <w:left w:val="none"/>
+              <w:bottom w:sz="4" w:val="single" w:color="E2E8F0"/>
+              <w:right w:val="none"/>
+            </w:tcBorders>
           </w:tcPr>
           <w:p>
             <w:pPr>
               <w:jc w:val="left"/>
             </w:pPr>
             <w:r>
-              <w:t>Web POS Application (Dine-in, Ledgers, Reports)</w:t>
+              <w:rPr>
+                <w:rFonts w:ascii="Calibri" w:hAnsi="Calibri"/>
+                <w:color w:val="334155"/>
+                <w:sz w:val="20"/>
+              </w:rPr>
+              <w:t>Desktop POS Application (with full Web UI)</w:t>
             </w:r>
           </w:p>
         </w:tc>
         <w:tc>
           <w:tcPr>
             <w:tcW w:type="dxa" w:w="3312"/>
+            <w:shd w:val="clear" w:color="auto" w:fill="FFFFFF"/>
+            <w:tcMar>
+              <w:top w:w="120" w:type="dxa"/>
+              <w:bottom w:w="120" w:type="dxa"/>
+              <w:left w:w="180" w:type="dxa"/>
+              <w:right w:w="180" w:type="dxa"/>
+            </w:tcMar>
+            <w:tcBorders>
+              <w:top w:val="none"/>
+              <w:left w:val="none"/>
+              <w:bottom w:sz="4" w:val="single" w:color="E2E8F0"/>
+              <w:right w:val="none"/>
+            </w:tcBorders>
           </w:tcPr>
           <w:p>
             <w:pPr>
-              <w:jc w:val="center"/>
+              <w:jc w:val="right"/>
             </w:pPr>
             <w:r>
-              <w:t>PKR 120,000</w:t>
+              <w:rPr>
+                <w:rFonts w:ascii="Calibri" w:hAnsi="Calibri"/>
+                <w:color w:val="334155"/>
+                <w:sz w:val="20"/>
+              </w:rPr>
+              <w:t>PKR 2,00,000</w:t>
             </w:r>
           </w:p>
         </w:tc>
         <w:tc>
           <w:tcPr>
             <w:tcW w:type="dxa" w:w="3312"/>
+            <w:shd w:val="clear" w:color="auto" w:fill="FFFFFF"/>
+            <w:tcMar>
+              <w:top w:w="120" w:type="dxa"/>
+              <w:bottom w:w="120" w:type="dxa"/>
+              <w:left w:w="180" w:type="dxa"/>
+              <w:right w:w="180" w:type="dxa"/>
+            </w:tcMar>
+            <w:tcBorders>
+              <w:top w:val="none"/>
+              <w:left w:val="none"/>
+              <w:bottom w:sz="4" w:val="single" w:color="E2E8F0"/>
+              <w:right w:val="none"/>
+            </w:tcBorders>
           </w:tcPr>
           <w:p>
             <w:pPr>
-              <w:jc w:val="center"/>
+              <w:jc w:val="right"/>
             </w:pPr>
             <w:r>
-              <w:t>PKR 35,000</w:t>
+              <w:rPr>
+                <w:rFonts w:ascii="Calibri" w:hAnsi="Calibri"/>
+                <w:b/>
+                <w:color w:val="334155"/>
+                <w:sz w:val="20"/>
+              </w:rPr>
+              <w:t>PKR 55,000</w:t>
             </w:r>
           </w:p>
         </w:tc>
@@ -387,79 +489,93 @@
         <w:tc>
           <w:tcPr>
             <w:tcW w:type="dxa" w:w="3312"/>
+            <w:shd w:val="clear" w:color="auto" w:fill="F8FAFC"/>
+            <w:tcMar>
+              <w:top w:w="120" w:type="dxa"/>
+              <w:bottom w:w="120" w:type="dxa"/>
+              <w:left w:w="180" w:type="dxa"/>
+              <w:right w:w="180" w:type="dxa"/>
+            </w:tcMar>
+            <w:tcBorders>
+              <w:top w:val="none"/>
+              <w:left w:val="none"/>
+              <w:bottom w:sz="4" w:val="single" w:color="E2E8F0"/>
+              <w:right w:val="none"/>
+            </w:tcBorders>
           </w:tcPr>
           <w:p>
             <w:pPr>
               <w:jc w:val="left"/>
             </w:pPr>
             <w:r>
-              <w:t>Desktop Application Wrapper (Electron Offline)</w:t>
+              <w:rPr>
+                <w:rFonts w:ascii="Calibri" w:hAnsi="Calibri"/>
+                <w:color w:val="334155"/>
+                <w:sz w:val="20"/>
+              </w:rPr>
+              <w:t>Mobile App (4 Roles)</w:t>
             </w:r>
           </w:p>
         </w:tc>
         <w:tc>
           <w:tcPr>
             <w:tcW w:type="dxa" w:w="3312"/>
+            <w:shd w:val="clear" w:color="auto" w:fill="F8FAFC"/>
+            <w:tcMar>
+              <w:top w:w="120" w:type="dxa"/>
+              <w:bottom w:w="120" w:type="dxa"/>
+              <w:left w:w="180" w:type="dxa"/>
+              <w:right w:w="180" w:type="dxa"/>
+            </w:tcMar>
+            <w:tcBorders>
+              <w:top w:val="none"/>
+              <w:left w:val="none"/>
+              <w:bottom w:sz="4" w:val="single" w:color="E2E8F0"/>
+              <w:right w:val="none"/>
+            </w:tcBorders>
           </w:tcPr>
           <w:p>
             <w:pPr>
-              <w:jc w:val="center"/>
+              <w:jc w:val="right"/>
             </w:pPr>
             <w:r>
-              <w:t>PKR 80,000</w:t>
+              <w:rPr>
+                <w:rFonts w:ascii="Calibri" w:hAnsi="Calibri"/>
+                <w:color w:val="334155"/>
+                <w:sz w:val="20"/>
+              </w:rPr>
+              <w:t>PKR 1,80,000</w:t>
             </w:r>
           </w:p>
         </w:tc>
         <w:tc>
           <w:tcPr>
             <w:tcW w:type="dxa" w:w="3312"/>
+            <w:shd w:val="clear" w:color="auto" w:fill="F8FAFC"/>
+            <w:tcMar>
+              <w:top w:w="120" w:type="dxa"/>
+              <w:bottom w:w="120" w:type="dxa"/>
+              <w:left w:w="180" w:type="dxa"/>
+              <w:right w:w="180" w:type="dxa"/>
+            </w:tcMar>
+            <w:tcBorders>
+              <w:top w:val="none"/>
+              <w:left w:val="none"/>
+              <w:bottom w:sz="4" w:val="single" w:color="E2E8F0"/>
+              <w:right w:val="none"/>
+            </w:tcBorders>
           </w:tcPr>
           <w:p>
             <w:pPr>
-              <w:jc w:val="center"/>
+              <w:jc w:val="right"/>
             </w:pPr>
             <w:r>
-              <w:t>PKR 20,000</w:t>
-            </w:r>
-          </w:p>
-        </w:tc>
-      </w:tr>
-      <w:tr>
-        <w:tc>
-          <w:tcPr>
-            <w:tcW w:type="dxa" w:w="3312"/>
-          </w:tcPr>
-          <w:p>
-            <w:pPr>
-              <w:jc w:val="left"/>
-            </w:pPr>
-            <w:r>
-              <w:t>Mobile Application (Multi-role: Waiter, Kitchen, Rider, Admin)</w:t>
-            </w:r>
-          </w:p>
-        </w:tc>
-        <w:tc>
-          <w:tcPr>
-            <w:tcW w:type="dxa" w:w="3312"/>
-          </w:tcPr>
-          <w:p>
-            <w:pPr>
-              <w:jc w:val="center"/>
-            </w:pPr>
-            <w:r>
-              <w:t>PKR 180,000</w:t>
-            </w:r>
-          </w:p>
-        </w:tc>
-        <w:tc>
-          <w:tcPr>
-            <w:tcW w:type="dxa" w:w="3312"/>
-          </w:tcPr>
-          <w:p>
-            <w:pPr>
-              <w:jc w:val="center"/>
-            </w:pPr>
-            <w:r>
+              <w:rPr>
+                <w:rFonts w:ascii="Calibri" w:hAnsi="Calibri"/>
+                <w:b/>
+                <w:color w:val="334155"/>
+                <w:sz w:val="20"/>
+              </w:rPr>
               <w:t>PKR 55,000</w:t>
             </w:r>
           </w:p>
@@ -470,11 +586,26 @@
           <w:tcPr>
             <w:tcW w:type="dxa" w:w="3312"/>
             <w:shd w:val="clear" w:color="auto" w:fill="F1F5F9"/>
+            <w:tcMar>
+              <w:top w:w="140" w:type="dxa"/>
+              <w:bottom w:w="140" w:type="dxa"/>
+              <w:left w:w="180" w:type="dxa"/>
+              <w:right w:w="180" w:type="dxa"/>
+            </w:tcMar>
+            <w:tcBorders>
+              <w:top w:sz="4" w:val="single" w:color="0F172A"/>
+              <w:left w:val="none"/>
+              <w:bottom w:sz="4" w:val="single" w:color="0F172A"/>
+              <w:right w:val="none"/>
+            </w:tcBorders>
           </w:tcPr>
           <w:p>
             <w:r>
               <w:rPr>
+                <w:rFonts w:ascii="Calibri" w:hAnsi="Calibri"/>
                 <w:b/>
+                <w:color w:val="0F172A"/>
+                <w:sz w:val="21"/>
               </w:rPr>
               <w:t>TOTAL AMOUNT DUE</w:t>
             </w:r>
@@ -484,16 +615,31 @@
           <w:tcPr>
             <w:tcW w:type="dxa" w:w="3312"/>
             <w:shd w:val="clear" w:color="auto" w:fill="F1F5F9"/>
+            <w:tcMar>
+              <w:top w:w="140" w:type="dxa"/>
+              <w:bottom w:w="140" w:type="dxa"/>
+              <w:left w:w="180" w:type="dxa"/>
+              <w:right w:w="180" w:type="dxa"/>
+            </w:tcMar>
+            <w:tcBorders>
+              <w:top w:sz="4" w:val="single" w:color="0F172A"/>
+              <w:left w:val="none"/>
+              <w:bottom w:sz="4" w:val="single" w:color="0F172A"/>
+              <w:right w:val="none"/>
+            </w:tcBorders>
           </w:tcPr>
           <w:p>
             <w:pPr>
-              <w:jc w:val="center"/>
+              <w:jc w:val="right"/>
             </w:pPr>
             <w:r>
               <w:rPr>
+                <w:rFonts w:ascii="Calibri" w:hAnsi="Calibri"/>
                 <w:b/>
+                <w:color w:val="64748B"/>
+                <w:sz w:val="21"/>
               </w:rPr>
-              <w:t>PKR 380,000</w:t>
+              <w:t>PKR 3,80,000</w:t>
             </w:r>
           </w:p>
         </w:tc>
@@ -501,16 +647,31 @@
           <w:tcPr>
             <w:tcW w:type="dxa" w:w="3312"/>
             <w:shd w:val="clear" w:color="auto" w:fill="FFE5D9"/>
+            <w:tcMar>
+              <w:top w:w="140" w:type="dxa"/>
+              <w:bottom w:w="140" w:type="dxa"/>
+              <w:left w:w="180" w:type="dxa"/>
+              <w:right w:w="180" w:type="dxa"/>
+            </w:tcMar>
+            <w:tcBorders>
+              <w:top w:sz="4" w:val="single" w:color="0F172A"/>
+              <w:left w:val="none"/>
+              <w:bottom w:sz="4" w:val="single" w:color="0F172A"/>
+              <w:right w:val="none"/>
+            </w:tcBorders>
           </w:tcPr>
           <w:p>
             <w:pPr>
-              <w:jc w:val="center"/>
+              <w:jc w:val="right"/>
             </w:pPr>
             <w:r>
               <w:rPr>
+                <w:rFonts w:ascii="Calibri" w:hAnsi="Calibri"/>
                 <w:b/>
+                <w:color w:val="EA580C"/>
+                <w:sz w:val="22"/>
               </w:rPr>
-              <w:t>PKR 110,000</w:t>
+              <w:t>PKR 1,10,000</w:t>
             </w:r>
           </w:p>
         </w:tc>
@@ -518,7 +679,7 @@
     </w:tbl>
     <w:p>
       <w:pPr>
-        <w:spacing w:before="200"/>
+        <w:spacing w:before="240"/>
       </w:pPr>
       <w:r>
         <w:rPr>
@@ -527,16 +688,17 @@
           <w:color w:val="16A34A"/>
           <w:sz w:val="19"/>
         </w:rPr>
-        <w:t>Special Discount Applied: PKR 270,000 (71% Off value saving as a special client)</w:t>
+        <w:t>Special Discount Applied: PKR 270,000 (71% Value Saving for Zaiqah Restaurant)</w:t>
       </w:r>
     </w:p>
     <w:p>
       <w:pPr>
         <w:pStyle w:val="Heading1"/>
-        <w:spacing w:before="400" w:after="120"/>
+        <w:spacing w:before="480" w:after="160"/>
       </w:pPr>
       <w:r>
         <w:rPr>
+          <w:b/>
           <w:color w:val="0F172A"/>
           <w:sz w:val="28"/>
         </w:rPr>
@@ -594,10 +756,11 @@
     <w:p>
       <w:pPr>
         <w:pStyle w:val="Heading1"/>
-        <w:spacing w:before="320" w:after="120"/>
+        <w:spacing w:before="400" w:after="160"/>
       </w:pPr>
       <w:r>
         <w:rPr>
+          <w:b/>
           <w:color w:val="0F172A"/>
           <w:sz w:val="28"/>
         </w:rPr>
@@ -606,7 +769,7 @@
     </w:p>
     <w:p>
       <w:pPr>
-        <w:spacing w:after="320"/>
+        <w:spacing w:after="400"/>
       </w:pPr>
       <w:r>
         <w:rPr>
@@ -617,7 +780,7 @@
     </w:p>
     <w:p>
       <w:pPr>
-        <w:spacing w:before="560"/>
+        <w:spacing w:before="720"/>
       </w:pPr>
       <w:r>
         <w:rPr>
@@ -629,7 +792,7 @@
       <w:r>
         <w:rPr>
           <w:b/>
-          <w:sz w:val="22"/>
+          <w:sz w:val="23"/>
         </w:rPr>
         <w:t>Hammad Aslam</w:t>
         <w:br/>
@@ -659,6 +822,7 @@
   <w:p>
     <w:pPr>
       <w:pStyle w:val="Footer"/>
+      <w:spacing w:before="240"/>
       <w:jc w:val="center"/>
     </w:pPr>
     <w:r>
@@ -667,7 +831,7 @@
         <w:color w:val="64748B"/>
         <w:sz w:val="17"/>
       </w:rPr>
-      <w:t>(+92) 302-1655553  |  support@asperinfotech.com  |  www.asperinfotech.com</w:t>
+      <w:t>(+92) 302-1655553   |   support@asperinfotech.com   |   www.asperinfotech.com</w:t>
       <w:br/>
     </w:r>
     <w:r>
@@ -687,28 +851,98 @@
   <w:p>
     <w:pPr>
       <w:pStyle w:val="Header"/>
-      <w:jc w:val="right"/>
-    </w:pPr>
-    <w:r>
-      <w:rPr>
-        <w:rFonts w:ascii="Calibri" w:hAnsi="Calibri"/>
-        <w:b/>
-        <w:color w:val="0F172A"/>
-        <w:sz w:val="22"/>
-      </w:rPr>
-      <w:t>Asper InfoTech (Pvt.) Ltd.</w:t>
-      <w:br/>
-    </w:r>
-    <w:r>
-      <w:rPr>
-        <w:rFonts w:ascii="Calibri" w:hAnsi="Calibri"/>
-        <w:i/>
-        <w:color w:val="64748B"/>
-        <w:sz w:val="17"/>
-      </w:rPr>
-      <w:t>Software Company / IT Training School</w:t>
-    </w:r>
+    </w:pPr>
+    <w:r/>
   </w:p>
+  <w:tbl>
+    <w:tblPr>
+      <w:tblW w:type="auto" w:w="0"/>
+      <w:tblLayout w:type="fixed"/>
+      <w:tblLook w:firstColumn="1" w:firstRow="1" w:lastColumn="0" w:lastRow="0" w:noHBand="0" w:noVBand="1" w:val="04A0"/>
+    </w:tblPr>
+    <w:tblGrid>
+      <w:gridCol w:w="1728"/>
+      <w:gridCol w:w="8208"/>
+    </w:tblGrid>
+    <w:tr>
+      <w:tc>
+        <w:tcPr>
+          <w:tcW w:type="dxa" w:w="4968"/>
+        </w:tcPr>
+        <w:p>
+          <w:pPr>
+            <w:jc w:val="left"/>
+          </w:pPr>
+          <w:r>
+            <w:drawing>
+              <wp:inline xmlns:a="http://schemas.openxmlformats.org/drawingml/2006/main" xmlns:pic="http://schemas.openxmlformats.org/drawingml/2006/picture">
+                <wp:extent cx="777240" cy="777240"/>
+                <wp:docPr id="1" name="Picture 1"/>
+                <wp:cNvGraphicFramePr>
+                  <a:graphicFrameLocks noChangeAspect="1"/>
+                </wp:cNvGraphicFramePr>
+                <a:graphic>
+                  <a:graphicData uri="http://schemas.openxmlformats.org/drawingml/2006/picture">
+                    <pic:pic>
+                      <pic:nvPicPr>
+                        <pic:cNvPr id="0" name="developer_brackets_logo_1781967320059.png"/>
+                        <pic:cNvPicPr/>
+                      </pic:nvPicPr>
+                      <pic:blipFill>
+                        <a:blip r:embed="rId1"/>
+                        <a:stretch>
+                          <a:fillRect/>
+                        </a:stretch>
+                      </pic:blipFill>
+                      <pic:spPr>
+                        <a:xfrm>
+                          <a:off x="0" y="0"/>
+                          <a:ext cx="777240" cy="777240"/>
+                        </a:xfrm>
+                        <a:prstGeom prst="rect"/>
+                      </pic:spPr>
+                    </pic:pic>
+                  </a:graphicData>
+                </a:graphic>
+              </wp:inline>
+            </w:drawing>
+          </w:r>
+        </w:p>
+      </w:tc>
+      <w:tc>
+        <w:tcPr>
+          <w:tcW w:type="dxa" w:w="4968"/>
+        </w:tcPr>
+        <w:p>
+          <w:pPr>
+            <w:spacing w:before="120"/>
+            <w:jc w:val="right"/>
+          </w:pPr>
+          <w:r>
+            <w:rPr>
+              <w:rFonts w:ascii="Calibri" w:hAnsi="Calibri"/>
+              <w:b/>
+              <w:color w:val="0F172A"/>
+              <w:sz w:val="26"/>
+            </w:rPr>
+            <w:t>Asper InfoTech (Pvt.) Ltd.</w:t>
+            <w:br/>
+          </w:r>
+          <w:r>
+            <w:rPr>
+              <w:rFonts w:ascii="Calibri" w:hAnsi="Calibri"/>
+              <w:i/>
+              <w:color w:val="64748B"/>
+              <w:sz w:val="17"/>
+            </w:rPr>
+            <w:t>Software Development | Premium Mobile &amp; Web Apps</w:t>
+            <w:br/>
+            <w:t>PSEB Certified | SECP Registered | Hasilpur, Pakistan</w:t>
+          </w:r>
+        </w:p>
+      </w:tc>
+    </w:tr>
+  </w:tbl>
 </w:hdr>
 </file>
 

</xml_diff>